<commit_message>
Add owner-wise comments, keep only PPT topics (remove popularity rule), auto-checked tests
</commit_message>
<xml_diff>
--- a/docs/Project_Report.docx
+++ b/docs/Project_Report.docx
@@ -979,7 +979,7 @@
               <w:rPr>
                 <w:sz w:val="20"/>
               </w:rPr>
-              <w:t>Genre / Author / Popularity rules</w:t>
+              <w:t>Genre and Author rules (reading history)</w:t>
             </w:r>
           </w:p>
         </w:tc>
@@ -1641,7 +1641,7 @@
               <w:rPr>
                 <w:sz w:val="20"/>
               </w:rPr>
-              <w:t>Student, Admin from User; GenreRule, AuthorRule, PopularityRule from Rule</w:t>
+              <w:t>Student, Admin from User; GenreRule, AuthorRule from Rule</w:t>
             </w:r>
           </w:p>
         </w:tc>
@@ -2349,10 +2349,7 @@
         <w:br/>
         <w:t xml:space="preserve">  |-- AuthorRule     : +3 for each past book of the same author</w:t>
         <w:br/>
-        <w:t xml:space="preserve">  |-- PopularityRule : + number of times the book was issued</w:t>
-        <w:br/>
-        <w:br/>
-        <w:t>Recommender : creates the three rules, scores every unread book, shows top 5</w:t>
+        <w:t>Recommender : creates the two rules, scores every unread book, shows top 5</w:t>
       </w:r>
     </w:p>
     <w:p>
@@ -2385,7 +2382,7 @@
         <w:pStyle w:val="ListBullet"/>
       </w:pPr>
       <w:r>
-        <w:t>Read all book IDs the user has borrowed before (issues.txt) - this is the 'history'.</w:t>
+        <w:t>Read all book IDs the user has borrowed before (issues.txt) - this is the 'reading history'.</w:t>
       </w:r>
     </w:p>
     <w:p>
@@ -2393,7 +2390,7 @@
         <w:pStyle w:val="ListBullet"/>
       </w:pPr>
       <w:r>
-        <w:t>For every book the user has NOT read: score = GenreRule + AuthorRule + PopularityRule.</w:t>
+        <w:t>For every book the user has NOT read: score = GenreRule points + AuthorRule points.</w:t>
       </w:r>
     </w:p>
     <w:p>
@@ -2401,7 +2398,7 @@
         <w:pStyle w:val="ListBullet"/>
       </w:pPr>
       <w:r>
-        <w:t>Sort by score (highest first) and show the top 5.</w:t>
+        <w:t>Keep only books with a score above 0, sort highest first, show the top 5.</w:t>
       </w:r>
     </w:p>
     <w:p>
@@ -2409,7 +2406,7 @@
         <w:pStyle w:val="ListBullet"/>
       </w:pPr>
       <w:r>
-        <w:t>If the user has no history, only popularity counts, so the most borrowed books are shown.</w:t>
+        <w:t>If the user has no reading history yet, the program says so and asks them to issue a few books first.</w:t>
       </w:r>
     </w:p>
     <w:p>
@@ -2438,16 +2435,15 @@
         <w:tblLook w:firstColumn="1" w:firstRow="1" w:lastColumn="0" w:lastRow="0" w:noHBand="0" w:noVBand="1" w:val="04A0"/>
       </w:tblPr>
       <w:tblGrid>
-        <w:gridCol w:w="1882"/>
-        <w:gridCol w:w="1882"/>
-        <w:gridCol w:w="1882"/>
-        <w:gridCol w:w="1882"/>
-        <w:gridCol w:w="1882"/>
+        <w:gridCol w:w="2353"/>
+        <w:gridCol w:w="2353"/>
+        <w:gridCol w:w="2353"/>
+        <w:gridCol w:w="2353"/>
       </w:tblGrid>
       <w:tr>
         <w:tc>
           <w:tcPr>
-            <w:tcW w:type="dxa" w:w="2835"/>
+            <w:tcW w:type="dxa" w:w="3118"/>
             <w:shd w:val="clear" w:color="auto" w:fill="1F3A5F"/>
           </w:tcPr>
           <w:p>
@@ -2464,7 +2460,7 @@
         </w:tc>
         <w:tc>
           <w:tcPr>
-            <w:tcW w:type="dxa" w:w="2551"/>
+            <w:tcW w:type="dxa" w:w="2835"/>
             <w:shd w:val="clear" w:color="auto" w:fill="1F3A5F"/>
           </w:tcPr>
           <w:p>
@@ -2475,13 +2471,13 @@
                 <w:color w:val="FFFFFF"/>
                 <w:sz w:val="20"/>
               </w:rPr>
-              <w:t>Genre points</w:t>
+              <w:t>Genre points (+2 each)</w:t>
             </w:r>
           </w:p>
         </w:tc>
         <w:tc>
           <w:tcPr>
-            <w:tcW w:type="dxa" w:w="1701"/>
+            <w:tcW w:type="dxa" w:w="2268"/>
             <w:shd w:val="clear" w:color="auto" w:fill="1F3A5F"/>
           </w:tcPr>
           <w:p>
@@ -2492,24 +2488,7 @@
                 <w:color w:val="FFFFFF"/>
                 <w:sz w:val="20"/>
               </w:rPr>
-              <w:t>Author points</w:t>
-            </w:r>
-          </w:p>
-        </w:tc>
-        <w:tc>
-          <w:tcPr>
-            <w:tcW w:type="dxa" w:w="1134"/>
-            <w:shd w:val="clear" w:color="auto" w:fill="1F3A5F"/>
-          </w:tcPr>
-          <w:p>
-            <w:r/>
-            <w:r>
-              <w:rPr>
-                <w:b/>
-                <w:color w:val="FFFFFF"/>
-                <w:sz w:val="20"/>
-              </w:rPr>
-              <w:t>Popularity</w:t>
+              <w:t>Author points (+3 each)</w:t>
             </w:r>
           </w:p>
         </w:tc>
@@ -2534,7 +2513,7 @@
       <w:tr>
         <w:tc>
           <w:tcPr>
-            <w:tcW w:type="dxa" w:w="2835"/>
+            <w:tcW w:type="dxa" w:w="3118"/>
           </w:tcPr>
           <w:p>
             <w:r/>
@@ -2548,7 +2527,7 @@
         </w:tc>
         <w:tc>
           <w:tcPr>
-            <w:tcW w:type="dxa" w:w="2551"/>
+            <w:tcW w:type="dxa" w:w="2835"/>
           </w:tcPr>
           <w:p>
             <w:r/>
@@ -2562,7 +2541,7 @@
         </w:tc>
         <w:tc>
           <w:tcPr>
-            <w:tcW w:type="dxa" w:w="1701"/>
+            <w:tcW w:type="dxa" w:w="2268"/>
           </w:tcPr>
           <w:p>
             <w:r/>
@@ -2584,21 +2563,7 @@
               <w:rPr>
                 <w:sz w:val="20"/>
               </w:rPr>
-              <w:t>1</w:t>
-            </w:r>
-          </w:p>
-        </w:tc>
-        <w:tc>
-          <w:tcPr>
-            <w:tcW w:type="dxa" w:w="1134"/>
-          </w:tcPr>
-          <w:p>
-            <w:r/>
-            <w:r>
-              <w:rPr>
-                <w:sz w:val="20"/>
-              </w:rPr>
-              <w:t>8</w:t>
+              <w:t>7</w:t>
             </w:r>
           </w:p>
         </w:tc>
@@ -2606,7 +2571,7 @@
       <w:tr>
         <w:tc>
           <w:tcPr>
-            <w:tcW w:type="dxa" w:w="2835"/>
+            <w:tcW w:type="dxa" w:w="3118"/>
           </w:tcPr>
           <w:p>
             <w:r/>
@@ -2620,7 +2585,7 @@
         </w:tc>
         <w:tc>
           <w:tcPr>
-            <w:tcW w:type="dxa" w:w="2551"/>
+            <w:tcW w:type="dxa" w:w="2835"/>
           </w:tcPr>
           <w:p>
             <w:r/>
@@ -2628,13 +2593,13 @@
               <w:rPr>
                 <w:sz w:val="20"/>
               </w:rPr>
-              <w:t>4</w:t>
+              <w:t>4 (two Fantasy books read)</w:t>
             </w:r>
           </w:p>
         </w:tc>
         <w:tc>
           <w:tcPr>
-            <w:tcW w:type="dxa" w:w="1701"/>
+            <w:tcW w:type="dxa" w:w="2268"/>
           </w:tcPr>
           <w:p>
             <w:r/>
@@ -2656,13 +2621,15 @@
               <w:rPr>
                 <w:sz w:val="20"/>
               </w:rPr>
-              <w:t>0</w:t>
+              <w:t>7</w:t>
             </w:r>
           </w:p>
         </w:tc>
+      </w:tr>
+      <w:tr>
         <w:tc>
           <w:tcPr>
-            <w:tcW w:type="dxa" w:w="1134"/>
+            <w:tcW w:type="dxa" w:w="3118"/>
           </w:tcPr>
           <w:p>
             <w:r/>
@@ -2670,12 +2637,10 @@
               <w:rPr>
                 <w:sz w:val="20"/>
               </w:rPr>
-              <w:t>7</w:t>
+              <w:t>105 / 101 / 103 (Programming books)</w:t>
             </w:r>
           </w:p>
         </w:tc>
-      </w:tr>
-      <w:tr>
         <w:tc>
           <w:tcPr>
             <w:tcW w:type="dxa" w:w="2835"/>
@@ -2686,27 +2651,13 @@
               <w:rPr>
                 <w:sz w:val="20"/>
               </w:rPr>
-              <w:t>101 The C Programming Language</w:t>
+              <w:t>2 (one Programming book read)</w:t>
             </w:r>
           </w:p>
         </w:tc>
         <w:tc>
           <w:tcPr>
-            <w:tcW w:type="dxa" w:w="2551"/>
-          </w:tcPr>
-          <w:p>
-            <w:r/>
-            <w:r>
-              <w:rPr>
-                <w:sz w:val="20"/>
-              </w:rPr>
-              <w:t>2 (one Programming book)</w:t>
-            </w:r>
-          </w:p>
-        </w:tc>
-        <w:tc>
-          <w:tcPr>
-            <w:tcW w:type="dxa" w:w="1701"/>
+            <w:tcW w:type="dxa" w:w="2268"/>
           </w:tcPr>
           <w:p>
             <w:r/>
@@ -2728,165 +2679,7 @@
               <w:rPr>
                 <w:sz w:val="20"/>
               </w:rPr>
-              <w:t>3</w:t>
-            </w:r>
-          </w:p>
-        </w:tc>
-        <w:tc>
-          <w:tcPr>
-            <w:tcW w:type="dxa" w:w="1134"/>
-          </w:tcPr>
-          <w:p>
-            <w:r/>
-            <w:r>
-              <w:rPr>
-                <w:sz w:val="20"/>
-              </w:rPr>
-              <w:t>5</w:t>
-            </w:r>
-          </w:p>
-        </w:tc>
-      </w:tr>
-      <w:tr>
-        <w:tc>
-          <w:tcPr>
-            <w:tcW w:type="dxa" w:w="2835"/>
-          </w:tcPr>
-          <w:p>
-            <w:r/>
-            <w:r>
-              <w:rPr>
-                <w:sz w:val="20"/>
-              </w:rPr>
-              <w:t>103 Let Us C</w:t>
-            </w:r>
-          </w:p>
-        </w:tc>
-        <w:tc>
-          <w:tcPr>
-            <w:tcW w:type="dxa" w:w="2551"/>
-          </w:tcPr>
-          <w:p>
-            <w:r/>
-            <w:r>
-              <w:rPr>
-                <w:sz w:val="20"/>
-              </w:rPr>
-              <w:t>2</w:t>
-            </w:r>
-          </w:p>
-        </w:tc>
-        <w:tc>
-          <w:tcPr>
-            <w:tcW w:type="dxa" w:w="1701"/>
-          </w:tcPr>
-          <w:p>
-            <w:r/>
-            <w:r>
-              <w:rPr>
-                <w:sz w:val="20"/>
-              </w:rPr>
-              <w:t>0</w:t>
-            </w:r>
-          </w:p>
-        </w:tc>
-        <w:tc>
-          <w:tcPr>
-            <w:tcW w:type="dxa" w:w="1134"/>
-          </w:tcPr>
-          <w:p>
-            <w:r/>
-            <w:r>
-              <w:rPr>
-                <w:sz w:val="20"/>
-              </w:rPr>
-              <w:t>2</w:t>
-            </w:r>
-          </w:p>
-        </w:tc>
-        <w:tc>
-          <w:tcPr>
-            <w:tcW w:type="dxa" w:w="1134"/>
-          </w:tcPr>
-          <w:p>
-            <w:r/>
-            <w:r>
-              <w:rPr>
-                <w:sz w:val="20"/>
-              </w:rPr>
-              <w:t>4</w:t>
-            </w:r>
-          </w:p>
-        </w:tc>
-      </w:tr>
-      <w:tr>
-        <w:tc>
-          <w:tcPr>
-            <w:tcW w:type="dxa" w:w="2835"/>
-          </w:tcPr>
-          <w:p>
-            <w:r/>
-            <w:r>
-              <w:rPr>
-                <w:sz w:val="20"/>
-              </w:rPr>
-              <w:t>205 The Alchemist</w:t>
-            </w:r>
-          </w:p>
-        </w:tc>
-        <w:tc>
-          <w:tcPr>
-            <w:tcW w:type="dxa" w:w="2551"/>
-          </w:tcPr>
-          <w:p>
-            <w:r/>
-            <w:r>
-              <w:rPr>
-                <w:sz w:val="20"/>
-              </w:rPr>
-              <w:t>0</w:t>
-            </w:r>
-          </w:p>
-        </w:tc>
-        <w:tc>
-          <w:tcPr>
-            <w:tcW w:type="dxa" w:w="1701"/>
-          </w:tcPr>
-          <w:p>
-            <w:r/>
-            <w:r>
-              <w:rPr>
-                <w:sz w:val="20"/>
-              </w:rPr>
-              <w:t>0</w:t>
-            </w:r>
-          </w:p>
-        </w:tc>
-        <w:tc>
-          <w:tcPr>
-            <w:tcW w:type="dxa" w:w="1134"/>
-          </w:tcPr>
-          <w:p>
-            <w:r/>
-            <w:r>
-              <w:rPr>
-                <w:sz w:val="20"/>
-              </w:rPr>
-              <w:t>3</w:t>
-            </w:r>
-          </w:p>
-        </w:tc>
-        <w:tc>
-          <w:tcPr>
-            <w:tcW w:type="dxa" w:w="1134"/>
-          </w:tcPr>
-          <w:p>
-            <w:r/>
-            <w:r>
-              <w:rPr>
-                <w:sz w:val="20"/>
-              </w:rPr>
-              <w:t>3</w:t>
+              <w:t>2 each</w:t>
             </w:r>
           </w:p>
         </w:tc>
@@ -2899,7 +2692,7 @@
           <w:b w:val="0"/>
           <w:i w:val="0"/>
         </w:rPr>
-        <w:t>The program output matches this table exactly (Test T6 below).</w:t>
+        <w:t>Equal scores keep the order of the books file. The program output matches this table exactly (Test T6). Books priya already read (201, 203, 102) are never shown (Test T6b).</w:t>
       </w:r>
     </w:p>
     <w:p>
@@ -2915,7 +2708,7 @@
         <w:pStyle w:val="ListBullet"/>
       </w:pPr>
       <w:r>
-        <w:t>Works: a reader who has borrowed several books of the same genre/author. Example: fantasy fan gets more fantasy.</w:t>
+        <w:t>Works: a reader who has borrowed several books of the same genre or author. Example: a fantasy reader gets more fantasy books.</w:t>
       </w:r>
     </w:p>
     <w:p>
@@ -2923,7 +2716,7 @@
         <w:pStyle w:val="ListBullet"/>
       </w:pPr>
       <w:r>
-        <w:t>Works: a brand-new reader - gets popular books (a 'cold start' fallback).</w:t>
+        <w:t>Does not work: a reader with no history - nothing to learn from, so the program only asks them to borrow books first.</w:t>
       </w:r>
     </w:p>
     <w:p>
@@ -2931,7 +2724,7 @@
         <w:pStyle w:val="ListBullet"/>
       </w:pPr>
       <w:r>
-        <w:t>Does not work well: a reader with only one or two borrowed books - suggestions are weak.</w:t>
+        <w:t>Does not work well: a reader with only one or two borrowed books - only one genre/author gets points, so suggestions are narrow.</w:t>
       </w:r>
     </w:p>
     <w:p>
@@ -2939,7 +2732,7 @@
         <w:pStyle w:val="ListBullet"/>
       </w:pPr>
       <w:r>
-        <w:t>Does not work well: a library where all books have the same genre/author or no popularity data - scores tie.</w:t>
+        <w:t>Does not work well: a library where most books share the same genre or author - many scores tie.</w:t>
       </w:r>
     </w:p>
     <w:p>
@@ -2947,7 +2740,7 @@
         <w:pStyle w:val="ListBullet"/>
       </w:pPr>
       <w:r>
-        <w:t>It does not understand book content (story, theme) - only genre, author and borrowing counts.</w:t>
+        <w:t>It does not understand book content (story, theme) - only genre, author and reading history.</w:t>
       </w:r>
     </w:p>
     <w:p>
@@ -3004,7 +2797,7 @@
           <w:b w:val="0"/>
           <w:i w:val="0"/>
         </w:rPr>
-        <w:t>Tests were run by feeding scripted input to the real program (run_tests.sh). Each test starts from fresh sample data (25 books, 3 users). Full output is in docs/test_output.txt.</w:t>
+        <w:t>Tests were run by feeding scripted input to the real program (run_tests.sh), which checks the output text and prints PASS or FAIL. Each test starts from fresh sample data (25 books, 3 users). Result: 14 tests passed, 0 failed. Full output is in docs/test_output.txt.</w:t>
       </w:r>
     </w:p>
     <w:tbl>
@@ -3206,7 +2999,7 @@
               <w:rPr>
                 <w:sz w:val="20"/>
               </w:rPr>
-              <w:t>Title search: 'the hobbit' (exact), 'harry' (partial), 'xyz'</w:t>
+              <w:t>Title search (BST): 'the hobbit' exact, 'harry' partial, 'xyz'</w:t>
             </w:r>
           </w:p>
         </w:tc>
@@ -3220,7 +3013,7 @@
               <w:rPr>
                 <w:sz w:val="20"/>
               </w:rPr>
-              <w:t>BST finds exact; partial gives A-Z list; not found message</w:t>
+              <w:t>Exact hit; partial list A-Z; not-found message</w:t>
             </w:r>
           </w:p>
         </w:tc>
@@ -3278,7 +3071,7 @@
               <w:rPr>
                 <w:sz w:val="20"/>
               </w:rPr>
-              <w:t>Search by ID 105 and 999 (hashing)</w:t>
+              <w:t>Search by ID (hashing): 105 and 999</w:t>
             </w:r>
           </w:p>
         </w:tc>
@@ -3336,7 +3129,7 @@
               <w:rPr>
                 <w:sz w:val="20"/>
               </w:rPr>
-              <w:t>T4</w:t>
+              <w:t>T4a</w:t>
             </w:r>
           </w:p>
         </w:tc>
@@ -3350,7 +3143,7 @@
               <w:rPr>
                 <w:sz w:val="20"/>
               </w:rPr>
-              <w:t>Sort by title, author, popularity</w:t>
+              <w:t>Sort by title</w:t>
             </w:r>
           </w:p>
         </w:tc>
@@ -3364,7 +3157,7 @@
               <w:rPr>
                 <w:sz w:val="20"/>
               </w:rPr>
-              <w:t>Correct order</w:t>
+              <w:t>A-Z</w:t>
             </w:r>
           </w:p>
         </w:tc>
@@ -3378,7 +3171,151 @@
               <w:rPr>
                 <w:sz w:val="20"/>
               </w:rPr>
-              <w:t>Title starts 'A Brief History of Time'; author starts 'A P J Abdul Kalam'; popularity starts with books issued 3 times</w:t>
+              <w:t>First book: A Brief History of Time</w:t>
+            </w:r>
+          </w:p>
+        </w:tc>
+        <w:tc>
+          <w:tcPr>
+            <w:tcW w:type="dxa" w:w="850"/>
+          </w:tcPr>
+          <w:p>
+            <w:r/>
+            <w:r>
+              <w:rPr>
+                <w:sz w:val="20"/>
+              </w:rPr>
+              <w:t>Pass</w:t>
+            </w:r>
+          </w:p>
+        </w:tc>
+      </w:tr>
+      <w:tr>
+        <w:tc>
+          <w:tcPr>
+            <w:tcW w:type="dxa" w:w="680"/>
+          </w:tcPr>
+          <w:p>
+            <w:r/>
+            <w:r>
+              <w:rPr>
+                <w:sz w:val="20"/>
+              </w:rPr>
+              <w:t>T4b</w:t>
+            </w:r>
+          </w:p>
+        </w:tc>
+        <w:tc>
+          <w:tcPr>
+            <w:tcW w:type="dxa" w:w="2438"/>
+          </w:tcPr>
+          <w:p>
+            <w:r/>
+            <w:r>
+              <w:rPr>
+                <w:sz w:val="20"/>
+              </w:rPr>
+              <w:t>Sort by author</w:t>
+            </w:r>
+          </w:p>
+        </w:tc>
+        <w:tc>
+          <w:tcPr>
+            <w:tcW w:type="dxa" w:w="2041"/>
+          </w:tcPr>
+          <w:p>
+            <w:r/>
+            <w:r>
+              <w:rPr>
+                <w:sz w:val="20"/>
+              </w:rPr>
+              <w:t>A-Z</w:t>
+            </w:r>
+          </w:p>
+        </w:tc>
+        <w:tc>
+          <w:tcPr>
+            <w:tcW w:type="dxa" w:w="3175"/>
+          </w:tcPr>
+          <w:p>
+            <w:r/>
+            <w:r>
+              <w:rPr>
+                <w:sz w:val="20"/>
+              </w:rPr>
+              <w:t>First author: A P J Abdul Kalam (Wings of Fire)</w:t>
+            </w:r>
+          </w:p>
+        </w:tc>
+        <w:tc>
+          <w:tcPr>
+            <w:tcW w:type="dxa" w:w="850"/>
+          </w:tcPr>
+          <w:p>
+            <w:r/>
+            <w:r>
+              <w:rPr>
+                <w:sz w:val="20"/>
+              </w:rPr>
+              <w:t>Pass</w:t>
+            </w:r>
+          </w:p>
+        </w:tc>
+      </w:tr>
+      <w:tr>
+        <w:tc>
+          <w:tcPr>
+            <w:tcW w:type="dxa" w:w="680"/>
+          </w:tcPr>
+          <w:p>
+            <w:r/>
+            <w:r>
+              <w:rPr>
+                <w:sz w:val="20"/>
+              </w:rPr>
+              <w:t>T4c</w:t>
+            </w:r>
+          </w:p>
+        </w:tc>
+        <w:tc>
+          <w:tcPr>
+            <w:tcW w:type="dxa" w:w="2438"/>
+          </w:tcPr>
+          <w:p>
+            <w:r/>
+            <w:r>
+              <w:rPr>
+                <w:sz w:val="20"/>
+              </w:rPr>
+              <w:t>Sort by popularity</w:t>
+            </w:r>
+          </w:p>
+        </w:tc>
+        <w:tc>
+          <w:tcPr>
+            <w:tcW w:type="dxa" w:w="2041"/>
+          </w:tcPr>
+          <w:p>
+            <w:r/>
+            <w:r>
+              <w:rPr>
+                <w:sz w:val="20"/>
+              </w:rPr>
+              <w:t>Most issued first</w:t>
+            </w:r>
+          </w:p>
+        </w:tc>
+        <w:tc>
+          <w:tcPr>
+            <w:tcW w:type="dxa" w:w="3175"/>
+          </w:tcPr>
+          <w:p>
+            <w:r/>
+            <w:r>
+              <w:rPr>
+                <w:sz w:val="20"/>
+              </w:rPr>
+              <w:t>First: Harry Potter 1 (issued 3 times)</w:t>
             </w:r>
           </w:p>
         </w:tc>
@@ -3450,7 +3387,7 @@
               <w:rPr>
                 <w:sz w:val="20"/>
               </w:rPr>
-              <w:t>Issued OK; 'already issued'; 'No book'; Returned OK; 'not issued by you'</w:t>
+              <w:t>Issued OK; 'already issued'; 'No book'; Returned OK; 'not issued'</w:t>
             </w:r>
           </w:p>
         </w:tc>
@@ -3494,7 +3431,7 @@
               <w:rPr>
                 <w:sz w:val="20"/>
               </w:rPr>
-              <w:t>Recommendation for user with history</w:t>
+              <w:t>Recommendation (genre + author) for priya</w:t>
             </w:r>
           </w:p>
         </w:tc>
@@ -3522,7 +3459,79 @@
               <w:rPr>
                 <w:sz w:val="20"/>
               </w:rPr>
-              <w:t>202=8, 204=7, 101=5, 103=4, 205=3; already-read books not shown</w:t>
+              <w:t>204=7, 202=7, then 105, 101, 103 = 2</w:t>
+            </w:r>
+          </w:p>
+        </w:tc>
+        <w:tc>
+          <w:tcPr>
+            <w:tcW w:type="dxa" w:w="850"/>
+          </w:tcPr>
+          <w:p>
+            <w:r/>
+            <w:r>
+              <w:rPr>
+                <w:sz w:val="20"/>
+              </w:rPr>
+              <w:t>Pass</w:t>
+            </w:r>
+          </w:p>
+        </w:tc>
+      </w:tr>
+      <w:tr>
+        <w:tc>
+          <w:tcPr>
+            <w:tcW w:type="dxa" w:w="680"/>
+          </w:tcPr>
+          <w:p>
+            <w:r/>
+            <w:r>
+              <w:rPr>
+                <w:sz w:val="20"/>
+              </w:rPr>
+              <w:t>T6b</w:t>
+            </w:r>
+          </w:p>
+        </w:tc>
+        <w:tc>
+          <w:tcPr>
+            <w:tcW w:type="dxa" w:w="2438"/>
+          </w:tcPr>
+          <w:p>
+            <w:r/>
+            <w:r>
+              <w:rPr>
+                <w:sz w:val="20"/>
+              </w:rPr>
+              <w:t>Recommendation must not show already-read books</w:t>
+            </w:r>
+          </w:p>
+        </w:tc>
+        <w:tc>
+          <w:tcPr>
+            <w:tcW w:type="dxa" w:w="2041"/>
+          </w:tcPr>
+          <w:p>
+            <w:r/>
+            <w:r>
+              <w:rPr>
+                <w:sz w:val="20"/>
+              </w:rPr>
+              <w:t>The Hobbit (read) absent</w:t>
+            </w:r>
+          </w:p>
+        </w:tc>
+        <w:tc>
+          <w:tcPr>
+            <w:tcW w:type="dxa" w:w="3175"/>
+          </w:tcPr>
+          <w:p>
+            <w:r/>
+            <w:r>
+              <w:rPr>
+                <w:sz w:val="20"/>
+              </w:rPr>
+              <w:t>Not present in the list</w:t>
             </w:r>
           </w:p>
         </w:tc>
@@ -3566,7 +3575,7 @@
               <w:rPr>
                 <w:sz w:val="20"/>
               </w:rPr>
-              <w:t>Recommendation for brand-new student</w:t>
+              <w:t>New student with no reading history asks for recommendations</w:t>
             </w:r>
           </w:p>
         </w:tc>
@@ -3580,7 +3589,7 @@
               <w:rPr>
                 <w:sz w:val="20"/>
               </w:rPr>
-              <w:t>Most popular books</w:t>
+              <w:t>Clear message</w:t>
             </w:r>
           </w:p>
         </w:tc>
@@ -3594,7 +3603,7 @@
               <w:rPr>
                 <w:sz w:val="20"/>
               </w:rPr>
-              <w:t>Top 3 (score 3) then 2; message 'No reading history yet'</w:t>
+              <w:t>'No reading history yet. Issue a few books first...'</w:t>
             </w:r>
           </w:p>
         </w:tc>
@@ -3768,79 +3777,7 @@
               <w:rPr>
                 <w:sz w:val="20"/>
               </w:rPr>
-              <w:t>T10</w:t>
-            </w:r>
-          </w:p>
-        </w:tc>
-        <w:tc>
-          <w:tcPr>
-            <w:tcW w:type="dxa" w:w="2438"/>
-          </w:tcPr>
-          <w:p>
-            <w:r/>
-            <w:r>
-              <w:rPr>
-                <w:sz w:val="20"/>
-              </w:rPr>
-              <w:t>Data saved to files</w:t>
-            </w:r>
-          </w:p>
-        </w:tc>
-        <w:tc>
-          <w:tcPr>
-            <w:tcW w:type="dxa" w:w="2041"/>
-          </w:tcPr>
-          <w:p>
-            <w:r/>
-            <w:r>
-              <w:rPr>
-                <w:sz w:val="20"/>
-              </w:rPr>
-              <w:t>books.txt and issues.txt updated</w:t>
-            </w:r>
-          </w:p>
-        </w:tc>
-        <w:tc>
-          <w:tcPr>
-            <w:tcW w:type="dxa" w:w="3175"/>
-          </w:tcPr>
-          <w:p>
-            <w:r/>
-            <w:r>
-              <w:rPr>
-                <w:sz w:val="20"/>
-              </w:rPr>
-              <w:t>201 -&gt; available 0, issued count 4; new ISSUED line added</w:t>
-            </w:r>
-          </w:p>
-        </w:tc>
-        <w:tc>
-          <w:tcPr>
-            <w:tcW w:type="dxa" w:w="850"/>
-          </w:tcPr>
-          <w:p>
-            <w:r/>
-            <w:r>
-              <w:rPr>
-                <w:sz w:val="20"/>
-              </w:rPr>
-              <w:t>Pass</w:t>
-            </w:r>
-          </w:p>
-        </w:tc>
-      </w:tr>
-      <w:tr>
-        <w:tc>
-          <w:tcPr>
-            <w:tcW w:type="dxa" w:w="680"/>
-          </w:tcPr>
-          <w:p>
-            <w:r/>
-            <w:r>
-              <w:rPr>
-                <w:sz w:val="20"/>
-              </w:rPr>
-              <w:t>Extra</w:t>
+              <w:t>T11</w:t>
             </w:r>
           </w:p>
         </w:tc>
@@ -3912,6 +3849,78 @@
               <w:rPr>
                 <w:sz w:val="20"/>
               </w:rPr>
+              <w:t>T12</w:t>
+            </w:r>
+          </w:p>
+        </w:tc>
+        <w:tc>
+          <w:tcPr>
+            <w:tcW w:type="dxa" w:w="2438"/>
+          </w:tcPr>
+          <w:p>
+            <w:r/>
+            <w:r>
+              <w:rPr>
+                <w:sz w:val="20"/>
+              </w:rPr>
+              <w:t>Data saved to files</w:t>
+            </w:r>
+          </w:p>
+        </w:tc>
+        <w:tc>
+          <w:tcPr>
+            <w:tcW w:type="dxa" w:w="2041"/>
+          </w:tcPr>
+          <w:p>
+            <w:r/>
+            <w:r>
+              <w:rPr>
+                <w:sz w:val="20"/>
+              </w:rPr>
+              <w:t>books.txt and issues.txt updated</w:t>
+            </w:r>
+          </w:p>
+        </w:tc>
+        <w:tc>
+          <w:tcPr>
+            <w:tcW w:type="dxa" w:w="3175"/>
+          </w:tcPr>
+          <w:p>
+            <w:r/>
+            <w:r>
+              <w:rPr>
+                <w:sz w:val="20"/>
+              </w:rPr>
+              <w:t>201 -&gt; available 0, issued count 4; new ISSUED line for rahul</w:t>
+            </w:r>
+          </w:p>
+        </w:tc>
+        <w:tc>
+          <w:tcPr>
+            <w:tcW w:type="dxa" w:w="850"/>
+          </w:tcPr>
+          <w:p>
+            <w:r/>
+            <w:r>
+              <w:rPr>
+                <w:sz w:val="20"/>
+              </w:rPr>
+              <w:t>Pass</w:t>
+            </w:r>
+          </w:p>
+        </w:tc>
+      </w:tr>
+      <w:tr>
+        <w:tc>
+          <w:tcPr>
+            <w:tcW w:type="dxa" w:w="680"/>
+          </w:tcPr>
+          <w:p>
+            <w:r/>
+            <w:r>
+              <w:rPr>
+                <w:sz w:val="20"/>
+              </w:rPr>
               <w:t>Extra</w:t>
             </w:r>
           </w:p>
@@ -3926,7 +3935,7 @@
               <w:rPr>
                 <w:sz w:val="20"/>
               </w:rPr>
-              <w:t>Memory check with valgrind (login, recommend, issue, return)</w:t>
+              <w:t>Compile with -Wall -Wextra; memory check with valgrind</w:t>
             </w:r>
           </w:p>
         </w:tc>
@@ -3940,7 +3949,7 @@
               <w:rPr>
                 <w:sz w:val="20"/>
               </w:rPr>
-              <w:t>No leaks / errors</w:t>
+              <w:t>No warnings, no leaks</w:t>
             </w:r>
           </w:p>
         </w:tc>
@@ -3954,7 +3963,7 @@
               <w:rPr>
                 <w:sz w:val="20"/>
               </w:rPr>
-              <w:t>0 errors</w:t>
+              <w:t>0 warnings; 0 memory errors</w:t>
             </w:r>
           </w:p>
         </w:tc>
@@ -4324,7 +4333,7 @@
               <w:rPr>
                 <w:sz w:val="20"/>
               </w:rPr>
-              <w:t>Recommendation uses only genre, author, popularity</w:t>
+              <w:t>Recommendation uses only genre, author and reading history</w:t>
             </w:r>
           </w:p>
         </w:tc>
@@ -4582,7 +4591,7 @@
               <w:rPr>
                 <w:sz w:val="20"/>
               </w:rPr>
-              <w:t>T5, T10</w:t>
+              <w:t>T5</w:t>
             </w:r>
           </w:p>
         </w:tc>
@@ -4656,7 +4665,7 @@
               <w:rPr>
                 <w:sz w:val="20"/>
               </w:rPr>
-              <w:t>T1, T2, T3, T4, T8, T9</w:t>
+              <w:t>T1, T2, T3, T4a-c, T8, T9, T11, T12</w:t>
             </w:r>
           </w:p>
         </w:tc>
@@ -4730,7 +4739,7 @@
               <w:rPr>
                 <w:sz w:val="20"/>
               </w:rPr>
-              <w:t>T6, T7, T9</w:t>
+              <w:t>T6, T6b, T7</w:t>
             </w:r>
           </w:p>
         </w:tc>

</xml_diff>

<commit_message>
Simplify code (bubble sort, simple recommender, splitLine, fixed arrays); add Debugging_Guide; update docs and tests (17 pass)
</commit_message>
<xml_diff>
--- a/docs/Project_Report.docx
+++ b/docs/Project_Report.docx
@@ -979,7 +979,7 @@
               <w:rPr>
                 <w:sz w:val="20"/>
               </w:rPr>
-              <w:t>Genre and Author rules (reading history)</w:t>
+              <w:t>Simple recommender: genre +2, author +3 (reading history)</w:t>
             </w:r>
           </w:p>
         </w:tc>
@@ -1411,7 +1411,7 @@
               <w:rPr>
                 <w:sz w:val="20"/>
               </w:rPr>
-              <w:t>Sorting (insertion sort)</w:t>
+              <w:t>Sorting (bubble sort)</w:t>
             </w:r>
           </w:p>
         </w:tc>
@@ -1439,7 +1439,7 @@
               <w:rPr>
                 <w:sz w:val="20"/>
               </w:rPr>
-              <w:t>Takes each book and inserts it at the right place in an already-sorted part.</w:t>
+              <w:t>Compares neighbouring books and swaps them if they are in the wrong order; repeats until sorted.</w:t>
             </w:r>
           </w:p>
         </w:tc>
@@ -1583,7 +1583,7 @@
               <w:rPr>
                 <w:sz w:val="20"/>
               </w:rPr>
-              <w:t>A class bundles data and the functions that work on it (User, Student, Admin, Rule...).</w:t>
+              <w:t>A class bundles data and the functions that work on it (User, Student, Admin, Recommender).</w:t>
             </w:r>
           </w:p>
         </w:tc>
@@ -1641,7 +1641,7 @@
               <w:rPr>
                 <w:sz w:val="20"/>
               </w:rPr>
-              <w:t>Student, Admin from User; GenreRule, AuthorRule from Rule</w:t>
+              <w:t>Student and Admin from User</w:t>
             </w:r>
           </w:p>
         </w:tc>
@@ -1713,7 +1713,7 @@
               <w:rPr>
                 <w:sz w:val="20"/>
               </w:rPr>
-              <w:t>User::menu(), Rule::score()</w:t>
+              <w:t>User::menu()</w:t>
             </w:r>
           </w:p>
         </w:tc>
@@ -1741,7 +1741,7 @@
               <w:rPr>
                 <w:sz w:val="20"/>
               </w:rPr>
-              <w:t>u-&gt;menu() shows the Student menu or Admin menu automatically; Recommender adds up any number of rules without knowing which.</w:t>
+              <w:t>u-&gt;menu() shows the Student menu or Admin menu automatically, without the caller knowing which object it holds.</w:t>
             </w:r>
           </w:p>
         </w:tc>
@@ -1963,7 +1963,7 @@
               <w:rPr>
                 <w:sz w:val="20"/>
               </w:rPr>
-              <w:t>Hash table (by ID), BST (by title), insertion sort (title/author/popularity).</w:t>
+              <w:t>Hash table (by ID), BST (by title), bubble sort (title/author/popularity).</w:t>
             </w:r>
           </w:p>
         </w:tc>
@@ -2007,7 +2007,7 @@
               <w:rPr>
                 <w:sz w:val="20"/>
               </w:rPr>
-              <w:t>User, Student, Admin classes; Rule classes; Recommender; login; input helpers.</w:t>
+              <w:t>User, Student, Admin classes; Recommender; login; input helpers.</w:t>
             </w:r>
           </w:p>
         </w:tc>
@@ -2343,13 +2343,13 @@
         <w:t xml:space="preserve">  |-- Admin     : add/delete book, issued report, create student account</w:t>
         <w:br/>
         <w:br/>
-        <w:t>Rule (abstract: score(book) is virtual)</w:t>
+        <w:t>Recommender : one function, recommend(user)</w:t>
         <w:br/>
-        <w:t xml:space="preserve">  |-- GenreRule      : +2 for each past book of the same genre</w:t>
+        <w:t xml:space="preserve">  +2 for each past book of the same genre</w:t>
         <w:br/>
-        <w:t xml:space="preserve">  |-- AuthorRule     : +3 for each past book of the same author</w:t>
+        <w:t xml:space="preserve">  +3 for each past book of the same author</w:t>
         <w:br/>
-        <w:t>Recommender : creates the two rules, scores every unread book, shows top 5</w:t>
+        <w:t xml:space="preserve">  scores every unread book, bubble-sorts, shows top 5</w:t>
       </w:r>
     </w:p>
     <w:p>
@@ -2390,7 +2390,7 @@
         <w:pStyle w:val="ListBullet"/>
       </w:pPr>
       <w:r>
-        <w:t>For every book the user has NOT read: score = GenreRule points + AuthorRule points.</w:t>
+        <w:t>For every book the user has NOT read: score = genre points (+2 each) + author points (+3 each).</w:t>
       </w:r>
     </w:p>
     <w:p>
@@ -2797,7 +2797,7 @@
           <w:b w:val="0"/>
           <w:i w:val="0"/>
         </w:rPr>
-        <w:t>Tests were run by feeding scripted input to the real program (run_tests.sh), which checks the output text and prints PASS or FAIL. Each test starts from fresh sample data (25 books, 3 users). Result: 14 tests passed, 0 failed. Full output is in docs/test_output.txt.</w:t>
+        <w:t>Tests were run by feeding scripted input to the real program (run_tests.sh), which checks the output text and prints PASS or FAIL. Each test starts from fresh sample data (25 books, 3 users). Result: 17 tests passed, 0 failed. Full output is in docs/test_output.txt.</w:t>
       </w:r>
     </w:p>
     <w:tbl>
@@ -3921,6 +3921,222 @@
               <w:rPr>
                 <w:sz w:val="20"/>
               </w:rPr>
+              <w:t>T13</w:t>
+            </w:r>
+          </w:p>
+        </w:tc>
+        <w:tc>
+          <w:tcPr>
+            <w:tcW w:type="dxa" w:w="2438"/>
+          </w:tcPr>
+          <w:p>
+            <w:r/>
+            <w:r>
+              <w:rPr>
+                <w:sz w:val="20"/>
+              </w:rPr>
+              <w:t>Very long search word (400 characters)</w:t>
+            </w:r>
+          </w:p>
+        </w:tc>
+        <w:tc>
+          <w:tcPr>
+            <w:tcW w:type="dxa" w:w="2041"/>
+          </w:tcPr>
+          <w:p>
+            <w:r/>
+            <w:r>
+              <w:rPr>
+                <w:sz w:val="20"/>
+              </w:rPr>
+              <w:t>No crash</w:t>
+            </w:r>
+          </w:p>
+        </w:tc>
+        <w:tc>
+          <w:tcPr>
+            <w:tcW w:type="dxa" w:w="3175"/>
+          </w:tcPr>
+          <w:p>
+            <w:r/>
+            <w:r>
+              <w:rPr>
+                <w:sz w:val="20"/>
+              </w:rPr>
+              <w:t>'No book found'</w:t>
+            </w:r>
+          </w:p>
+        </w:tc>
+        <w:tc>
+          <w:tcPr>
+            <w:tcW w:type="dxa" w:w="850"/>
+          </w:tcPr>
+          <w:p>
+            <w:r/>
+            <w:r>
+              <w:rPr>
+                <w:sz w:val="20"/>
+              </w:rPr>
+              <w:t>Pass</w:t>
+            </w:r>
+          </w:p>
+        </w:tc>
+      </w:tr>
+      <w:tr>
+        <w:tc>
+          <w:tcPr>
+            <w:tcW w:type="dxa" w:w="680"/>
+          </w:tcPr>
+          <w:p>
+            <w:r/>
+            <w:r>
+              <w:rPr>
+                <w:sz w:val="20"/>
+              </w:rPr>
+              <w:t>T14</w:t>
+            </w:r>
+          </w:p>
+        </w:tc>
+        <w:tc>
+          <w:tcPr>
+            <w:tcW w:type="dxa" w:w="2438"/>
+          </w:tcPr>
+          <w:p>
+            <w:r/>
+            <w:r>
+              <w:rPr>
+                <w:sz w:val="20"/>
+              </w:rPr>
+              <w:t>Data files with Windows (CRLF) line endings</w:t>
+            </w:r>
+          </w:p>
+        </w:tc>
+        <w:tc>
+          <w:tcPr>
+            <w:tcW w:type="dxa" w:w="2041"/>
+          </w:tcPr>
+          <w:p>
+            <w:r/>
+            <w:r>
+              <w:rPr>
+                <w:sz w:val="20"/>
+              </w:rPr>
+              <w:t>Still read correctly</w:t>
+            </w:r>
+          </w:p>
+        </w:tc>
+        <w:tc>
+          <w:tcPr>
+            <w:tcW w:type="dxa" w:w="3175"/>
+          </w:tcPr>
+          <w:p>
+            <w:r/>
+            <w:r>
+              <w:rPr>
+                <w:sz w:val="20"/>
+              </w:rPr>
+              <w:t>Books and logins work</w:t>
+            </w:r>
+          </w:p>
+        </w:tc>
+        <w:tc>
+          <w:tcPr>
+            <w:tcW w:type="dxa" w:w="850"/>
+          </w:tcPr>
+          <w:p>
+            <w:r/>
+            <w:r>
+              <w:rPr>
+                <w:sz w:val="20"/>
+              </w:rPr>
+              <w:t>Pass</w:t>
+            </w:r>
+          </w:p>
+        </w:tc>
+      </w:tr>
+      <w:tr>
+        <w:tc>
+          <w:tcPr>
+            <w:tcW w:type="dxa" w:w="680"/>
+          </w:tcPr>
+          <w:p>
+            <w:r/>
+            <w:r>
+              <w:rPr>
+                <w:sz w:val="20"/>
+              </w:rPr>
+              <w:t>T15</w:t>
+            </w:r>
+          </w:p>
+        </w:tc>
+        <w:tc>
+          <w:tcPr>
+            <w:tcW w:type="dxa" w:w="2438"/>
+          </w:tcPr>
+          <w:p>
+            <w:r/>
+            <w:r>
+              <w:rPr>
+                <w:sz w:val="20"/>
+              </w:rPr>
+              <w:t>books.txt missing</w:t>
+            </w:r>
+          </w:p>
+        </w:tc>
+        <w:tc>
+          <w:tcPr>
+            <w:tcW w:type="dxa" w:w="2041"/>
+          </w:tcPr>
+          <w:p>
+            <w:r/>
+            <w:r>
+              <w:rPr>
+                <w:sz w:val="20"/>
+              </w:rPr>
+              <w:t>Starts with empty library</w:t>
+            </w:r>
+          </w:p>
+        </w:tc>
+        <w:tc>
+          <w:tcPr>
+            <w:tcW w:type="dxa" w:w="3175"/>
+          </w:tcPr>
+          <w:p>
+            <w:r/>
+            <w:r>
+              <w:rPr>
+                <w:sz w:val="20"/>
+              </w:rPr>
+              <w:t>Message shown, no crash</w:t>
+            </w:r>
+          </w:p>
+        </w:tc>
+        <w:tc>
+          <w:tcPr>
+            <w:tcW w:type="dxa" w:w="850"/>
+          </w:tcPr>
+          <w:p>
+            <w:r/>
+            <w:r>
+              <w:rPr>
+                <w:sz w:val="20"/>
+              </w:rPr>
+              <w:t>Pass</w:t>
+            </w:r>
+          </w:p>
+        </w:tc>
+      </w:tr>
+      <w:tr>
+        <w:tc>
+          <w:tcPr>
+            <w:tcW w:type="dxa" w:w="680"/>
+          </w:tcPr>
+          <w:p>
+            <w:r/>
+            <w:r>
+              <w:rPr>
+                <w:sz w:val="20"/>
+              </w:rPr>
               <w:t>Extra</w:t>
             </w:r>
           </w:p>
@@ -4157,7 +4373,7 @@
               <w:rPr>
                 <w:sz w:val="20"/>
               </w:rPr>
-              <w:t>Insertion sort is slow for very big lists</w:t>
+              <w:t>Bubble sort is slow for very big lists</w:t>
             </w:r>
           </w:p>
         </w:tc>
@@ -4665,7 +4881,7 @@
               <w:rPr>
                 <w:sz w:val="20"/>
               </w:rPr>
-              <w:t>T1, T2, T3, T4a-c, T8, T9, T11, T12</w:t>
+              <w:t>T1, T2, T3, T4a-c, T8, T9, T11, T12, T13-T15</w:t>
             </w:r>
           </w:p>
         </w:tc>

</xml_diff>

<commit_message>
Merge code into 2 files (library.c, main.cpp), add make test, trim docs
</commit_message>
<xml_diff>
--- a/docs/Project_Report.docx
+++ b/docs/Project_Report.docx
@@ -1062,7 +1062,7 @@
           <w:b w:val="0"/>
           <w:i w:val="0"/>
         </w:rPr>
-        <w:t>The C files (list.c, search.c) are compiled with gcc and the C++ files (oop.cpp, main.cpp) with g++. They share one header, library.h. The header is wrapped in extern "C" { } so that C++ code can call the C functions. This is the only 'trick' in the project.</w:t>
+        <w:t>The C files (library.c, library.c) are compiled with gcc and the C++ files (main.cpp, main.cpp) with g++. They share one header, library.h. The header is wrapped in extern "C" { } so that C++ code can call the C functions. This is the only 'trick' in the project.</w:t>
       </w:r>
     </w:p>
     <w:p>
@@ -1209,7 +1209,7 @@
               <w:rPr>
                 <w:sz w:val="20"/>
               </w:rPr>
-              <w:t>list.c - stores all books</w:t>
+              <w:t>library.c - stores all books</w:t>
             </w:r>
           </w:p>
         </w:tc>
@@ -1281,7 +1281,7 @@
               <w:rPr>
                 <w:sz w:val="20"/>
               </w:rPr>
-              <w:t>search.c - find by book ID</w:t>
+              <w:t>library.c - find by book ID</w:t>
             </w:r>
           </w:p>
         </w:tc>
@@ -1353,7 +1353,7 @@
               <w:rPr>
                 <w:sz w:val="20"/>
               </w:rPr>
-              <w:t>search.c - search by title</w:t>
+              <w:t>library.c - search by title</w:t>
             </w:r>
           </w:p>
         </w:tc>
@@ -1425,7 +1425,7 @@
               <w:rPr>
                 <w:sz w:val="20"/>
               </w:rPr>
-              <w:t>search.c - sort by title / author / popularity</w:t>
+              <w:t>library.c - sort by title / author / popularity</w:t>
             </w:r>
           </w:p>
         </w:tc>
@@ -1497,7 +1497,7 @@
               <w:rPr>
                 <w:sz w:val="20"/>
               </w:rPr>
-              <w:t>list.c, oop.cpp</w:t>
+              <w:t>library.c, main.cpp</w:t>
             </w:r>
           </w:p>
         </w:tc>
@@ -1569,7 +1569,7 @@
               <w:rPr>
                 <w:sz w:val="20"/>
               </w:rPr>
-              <w:t>oop.h / oop.cpp</w:t>
+              <w:t>main.cpp / main.cpp</w:t>
             </w:r>
           </w:p>
         </w:tc>
@@ -1891,7 +1891,7 @@
               <w:rPr>
                 <w:sz w:val="20"/>
               </w:rPr>
-              <w:t>src/list.c</w:t>
+              <w:t>src/library.c</w:t>
             </w:r>
           </w:p>
         </w:tc>
@@ -1935,7 +1935,7 @@
               <w:rPr>
                 <w:sz w:val="20"/>
               </w:rPr>
-              <w:t>src/search.c</w:t>
+              <w:t>src/library.c</w:t>
             </w:r>
           </w:p>
         </w:tc>
@@ -1979,7 +1979,7 @@
               <w:rPr>
                 <w:sz w:val="20"/>
               </w:rPr>
-              <w:t>src/oop.h, src/oop.cpp</w:t>
+              <w:t>src/main.cpp, src/main.cpp</w:t>
             </w:r>
           </w:p>
         </w:tc>
@@ -4765,7 +4765,7 @@
               <w:rPr>
                 <w:sz w:val="20"/>
               </w:rPr>
-              <w:t>src/library.h, src/list.c, Makefile, data files</w:t>
+              <w:t>src/library.h, src/library.c, Makefile, data files</w:t>
             </w:r>
           </w:p>
         </w:tc>
@@ -4839,7 +4839,7 @@
               <w:rPr>
                 <w:sz w:val="20"/>
               </w:rPr>
-              <w:t>src/search.c, src/main.cpp, run_tests.sh</w:t>
+              <w:t>src/library.c, src/main.cpp, run_tests.sh</w:t>
             </w:r>
           </w:p>
         </w:tc>
@@ -4913,7 +4913,7 @@
               <w:rPr>
                 <w:sz w:val="20"/>
               </w:rPr>
-              <w:t>src/oop.h, src/oop.cpp</w:t>
+              <w:t>src/main.cpp, src/main.cpp</w:t>
             </w:r>
           </w:p>
         </w:tc>

</xml_diff>